<commit_message>
docs(b1-v1.1): ajustes obrigatorios Orquestrador — gate B1 aprovado — B2+B3 liberados
1. Coverage Engine formula corrigida (4 criterios simultaneos)
2. Question Quality Gate: pending_valid_question + no_valid_question_generated
3. evaluation_confidence no Gap (obrigatorio)

Issues: #63 #64 #65 | Milestone: Sprint-98-Confidence-Content-Engine
</commit_message>
<xml_diff>
--- a/docs/adr/ADR-010-content-architecture-98.docx
+++ b/docs/adr/ADR-010-content-architecture-98.docx
@@ -2,7 +2,7 @@
 <file path=word/document.xml><?xml version="1.0" encoding="utf-8"?>
 <w:document xmlns:w="http://schemas.openxmlformats.org/wordprocessingml/2006/main" xmlns:m="http://schemas.openxmlformats.org/officeDocument/2006/math" xmlns:r="http://schemas.openxmlformats.org/officeDocument/2006/relationships" xmlns:o="urn:schemas-microsoft-com:office:office" xmlns:v="urn:schemas-microsoft-com:vml" xmlns:w10="urn:schemas-microsoft-com:office:word" xmlns:a="http://schemas.openxmlformats.org/drawingml/2006/main" xmlns:pic="http://schemas.openxmlformats.org/drawingml/2006/picture" xmlns:wp="http://schemas.openxmlformats.org/drawingml/2006/wordprocessingDrawing">
   <w:body>
-    <w:bookmarkStart w:id="35" w:name="Xd462fc478eb03a9fe19aec3a6dce5ff7d4586c3"/>
+    <w:bookmarkStart w:id="39" w:name="Xd462fc478eb03a9fe19aec3a6dce5ff7d4586c3"/>
     <w:p>
       <w:pPr>
         <w:pStyle w:val="Heading1"/>
@@ -26,7 +26,7 @@
         <w:t xml:space="preserve"> </w:t>
       </w:r>
       <w:r>
-        <w:t xml:space="preserve">Proposto — aguardando aprovação do Orquestrador (gate B1)</w:t>
+        <w:t xml:space="preserve">Aprovado com ajustes obrigatórios — gate B1 liberado para B2 após incorporação dos ajustes</w:t>
       </w:r>
       <w:r>
         <w:br/>
@@ -836,33 +836,349 @@
     </w:p>
     <w:bookmarkEnd w:id="24"/>
     <w:bookmarkEnd w:id="25"/>
-    <w:bookmarkStart w:id="26" w:name="alternativas-consideradas"/>
+    <w:bookmarkStart w:id="29" w:name="Xfe0463b71f1acfd4f08265a354151d70357119e"/>
     <w:p>
       <w:pPr>
         <w:pStyle w:val="Heading2"/>
       </w:pPr>
       <w:r>
-        <w:t xml:space="preserve">Alternativas consideradas</w:t>
+        <w:t xml:space="preserve">Ajustes obrigatórios do Orquestrador (incorporados em 2026-03-24)</w:t>
       </w:r>
     </w:p>
     <w:p>
       <w:pPr>
         <w:pStyle w:val="FirstParagraph"/>
       </w:pPr>
+      <w:r>
+        <w:t xml:space="preserve">O Orquestrador aprovou o B1 com 3 ajustes obrigatórios que devem ser incorporados antes do início de B2. Os ajustes foram incorporados neste ADR e refletidos nas Matrizes Canônica e de Rastreabilidade.</w:t>
+      </w:r>
+    </w:p>
+    <w:bookmarkStart w:id="26" w:name="Xfe8a59ddb6d387a4be0a0f7d796f453551c40ff"/>
+    <w:p>
+      <w:pPr>
+        <w:pStyle w:val="Heading3"/>
+      </w:pPr>
+      <w:r>
+        <w:t xml:space="preserve">Ajuste 1 — Coverage Engine: fórmula corrigida</w:t>
+      </w:r>
+    </w:p>
+    <w:p>
+      <w:pPr>
+        <w:pStyle w:val="FirstParagraph"/>
+      </w:pPr>
+      <w:r>
+        <w:t xml:space="preserve">A fórmula original</w:t>
+      </w:r>
+      <w:r>
+        <w:t xml:space="preserve"> </w:t>
+      </w:r>
+      <w:r>
+        <w:rPr>
+          <w:rStyle w:val="VerbatimChar"/>
+        </w:rPr>
+        <w:t xml:space="preserve">coverage = gaps_classificados / requisitos_aplicáveis</w:t>
+      </w:r>
+      <w:r>
+        <w:t xml:space="preserve"> </w:t>
+      </w:r>
+      <w:r>
+        <w:t xml:space="preserve">foi considerada insuficiente porque contabilizava gaps classificados mesmo quando a pergunta era de baixa qualidade ou a evidência era insuficiente.</w:t>
+      </w:r>
+    </w:p>
+    <w:p>
+      <w:pPr>
+        <w:pStyle w:val="BodyText"/>
+      </w:pPr>
+      <w:r>
+        <w:t xml:space="preserve">A fórmula corrigida é:</w:t>
+      </w:r>
+    </w:p>
+    <w:p>
+      <w:pPr>
+        <w:pStyle w:val="SourceCode"/>
+      </w:pPr>
+      <w:r>
+        <w:rPr>
+          <w:rStyle w:val="VerbatimChar"/>
+        </w:rPr>
+        <w:t xml:space="preserve">coverage =</w:t>
+      </w:r>
+      <w:r>
+        <w:br/>
+      </w:r>
+      <w:r>
+        <w:rPr>
+          <w:rStyle w:val="VerbatimChar"/>
+        </w:rPr>
+        <w:t xml:space="preserve">  (requisitos com pergunta válida</w:t>
+      </w:r>
+      <w:r>
+        <w:br/>
+      </w:r>
+      <w:r>
+        <w:rPr>
+          <w:rStyle w:val="VerbatimChar"/>
+        </w:rPr>
+        <w:t xml:space="preserve">   + resposta válida</w:t>
+      </w:r>
+      <w:r>
+        <w:br/>
+      </w:r>
+      <w:r>
+        <w:rPr>
+          <w:rStyle w:val="VerbatimChar"/>
+        </w:rPr>
+        <w:t xml:space="preserve">   + gap classificado</w:t>
+      </w:r>
+      <w:r>
+        <w:br/>
+      </w:r>
+      <w:r>
+        <w:rPr>
+          <w:rStyle w:val="VerbatimChar"/>
+        </w:rPr>
+        <w:t xml:space="preserve">   + evidência suficiente)</w:t>
+      </w:r>
+      <w:r>
+        <w:br/>
+      </w:r>
+      <w:r>
+        <w:rPr>
+          <w:rStyle w:val="VerbatimChar"/>
+        </w:rPr>
+        <w:t xml:space="preserve">  /</w:t>
+      </w:r>
+      <w:r>
+        <w:br/>
+      </w:r>
+      <w:r>
+        <w:rPr>
+          <w:rStyle w:val="VerbatimChar"/>
+        </w:rPr>
+        <w:t xml:space="preserve">  (requisitos aplicáveis)</w:t>
+      </w:r>
+    </w:p>
+    <w:p>
+      <w:pPr>
+        <w:pStyle w:val="FirstParagraph"/>
+      </w:pPr>
+      <w:r>
+        <w:t xml:space="preserve">Um requisito só conta como coberto quando</w:t>
+      </w:r>
+      <w:r>
+        <w:t xml:space="preserve"> </w:t>
+      </w:r>
       <w:r>
         <w:rPr>
           <w:bCs/>
           <w:b/>
         </w:rPr>
-        <w:t xml:space="preserve">Alternativa A — Melhorar os prompts existentes sem reestruturar a arquitetura.</w:t>
-      </w:r>
-      <w:r>
-        <w:t xml:space="preserve"> </w:t>
-      </w:r>
-      <w:r>
-        <w:t xml:space="preserve">Descartada porque o problema não é de qualidade de prompt, mas de ausência de estrutura de dados formal entre as etapas. Prompts melhores sobre uma arquitetura sem contrato formal produzirão outputs melhores, mas não rastreáveis e não auditáveis.</w:t>
-      </w:r>
-    </w:p>
+        <w:t xml:space="preserve">todos os 4 critérios</w:t>
+      </w:r>
+      <w:r>
+        <w:t xml:space="preserve"> </w:t>
+      </w:r>
+      <w:r>
+        <w:t xml:space="preserve">são satisfeitos simultaneamente:</w:t>
+      </w:r>
+    </w:p>
+    <w:tbl>
+      <w:tblPr>
+        <w:tblStyle w:val="Table"/>
+        <w:tblW w:type="pct" w:w="5000"/>
+        <w:tblLook w:firstRow="1" w:lastRow="0" w:firstColumn="0" w:lastColumn="0" w:noHBand="0" w:noVBand="0" w:val="0020"/>
+        <w:jc w:val="start"/>
+        <w:tblLayout w:type="fixed"/>
+      </w:tblPr>
+      <w:tblGrid>
+        <w:gridCol w:w="3771"/>
+        <w:gridCol w:w="4148"/>
+      </w:tblGrid>
+      <w:tr>
+        <w:trPr>
+          <w:tblHeader w:val="true"/>
+        </w:trPr>
+        <w:tc>
+          <w:tcPr/>
+          <w:p>
+            <w:pPr>
+              <w:pStyle w:val="Compact"/>
+              <w:jc w:val="left"/>
+            </w:pPr>
+            <w:r>
+              <w:t xml:space="preserve">Critério</w:t>
+            </w:r>
+          </w:p>
+        </w:tc>
+        <w:tc>
+          <w:tcPr/>
+          <w:p>
+            <w:pPr>
+              <w:pStyle w:val="Compact"/>
+              <w:jc w:val="left"/>
+            </w:pPr>
+            <w:r>
+              <w:t xml:space="preserve">Definição</w:t>
+            </w:r>
+          </w:p>
+        </w:tc>
+      </w:tr>
+      <w:tr>
+        <w:tc>
+          <w:tcPr/>
+          <w:p>
+            <w:pPr>
+              <w:pStyle w:val="Compact"/>
+              <w:jc w:val="left"/>
+            </w:pPr>
+            <w:r>
+              <w:t xml:space="preserve">Pergunta válida</w:t>
+            </w:r>
+          </w:p>
+        </w:tc>
+        <w:tc>
+          <w:tcPr/>
+          <w:p>
+            <w:pPr>
+              <w:pStyle w:val="Compact"/>
+              <w:jc w:val="left"/>
+            </w:pPr>
+            <w:r>
+              <w:rPr>
+                <w:rStyle w:val="VerbatimChar"/>
+              </w:rPr>
+              <w:t xml:space="preserve">question.score &gt;= threshold</w:t>
+            </w:r>
+            <w:r>
+              <w:t xml:space="preserve"> </w:t>
+            </w:r>
+            <w:r>
+              <w:t xml:space="preserve">(padrão: 3.5/5.0)</w:t>
+            </w:r>
+          </w:p>
+        </w:tc>
+      </w:tr>
+      <w:tr>
+        <w:tc>
+          <w:tcPr/>
+          <w:p>
+            <w:pPr>
+              <w:pStyle w:val="Compact"/>
+              <w:jc w:val="left"/>
+            </w:pPr>
+            <w:r>
+              <w:t xml:space="preserve">Resposta válida</w:t>
+            </w:r>
+          </w:p>
+        </w:tc>
+        <w:tc>
+          <w:tcPr/>
+          <w:p>
+            <w:pPr>
+              <w:pStyle w:val="Compact"/>
+              <w:jc w:val="left"/>
+            </w:pPr>
+            <w:r>
+              <w:rPr>
+                <w:rStyle w:val="VerbatimChar"/>
+              </w:rPr>
+              <w:t xml:space="preserve">answer.answer_value</w:t>
+            </w:r>
+            <w:r>
+              <w:t xml:space="preserve"> </w:t>
+            </w:r>
+            <w:r>
+              <w:t xml:space="preserve">não nulo e não vazio</w:t>
+            </w:r>
+          </w:p>
+        </w:tc>
+      </w:tr>
+      <w:tr>
+        <w:tc>
+          <w:tcPr/>
+          <w:p>
+            <w:pPr>
+              <w:pStyle w:val="Compact"/>
+              <w:jc w:val="left"/>
+            </w:pPr>
+            <w:r>
+              <w:t xml:space="preserve">Gap classificado</w:t>
+            </w:r>
+          </w:p>
+        </w:tc>
+        <w:tc>
+          <w:tcPr/>
+          <w:p>
+            <w:pPr>
+              <w:pStyle w:val="Compact"/>
+              <w:jc w:val="left"/>
+            </w:pPr>
+            <w:r>
+              <w:rPr>
+                <w:rStyle w:val="VerbatimChar"/>
+              </w:rPr>
+              <w:t xml:space="preserve">gap.gap_status</w:t>
+            </w:r>
+            <w:r>
+              <w:t xml:space="preserve"> </w:t>
+            </w:r>
+            <w:r>
+              <w:t xml:space="preserve">∈ {atende, nao_atende, parcial, evidencia_insuficiente, nao_aplicavel}</w:t>
+            </w:r>
+          </w:p>
+        </w:tc>
+      </w:tr>
+      <w:tr>
+        <w:tc>
+          <w:tcPr/>
+          <w:p>
+            <w:pPr>
+              <w:pStyle w:val="Compact"/>
+              <w:jc w:val="left"/>
+            </w:pPr>
+            <w:r>
+              <w:t xml:space="preserve">Evidência suficiente</w:t>
+            </w:r>
+          </w:p>
+        </w:tc>
+        <w:tc>
+          <w:tcPr/>
+          <w:p>
+            <w:pPr>
+              <w:pStyle w:val="Compact"/>
+              <w:jc w:val="left"/>
+            </w:pPr>
+            <w:r>
+              <w:rPr>
+                <w:rStyle w:val="VerbatimChar"/>
+              </w:rPr>
+              <w:t xml:space="preserve">gap.gap_status ≠ evidencia_insuficiente</w:t>
+            </w:r>
+            <w:r>
+              <w:t xml:space="preserve"> </w:t>
+            </w:r>
+            <w:r>
+              <w:t xml:space="preserve">OU</w:t>
+            </w:r>
+            <w:r>
+              <w:t xml:space="preserve"> </w:t>
+            </w:r>
+            <w:r>
+              <w:rPr>
+                <w:rStyle w:val="VerbatimChar"/>
+              </w:rPr>
+              <w:t xml:space="preserve">gap.evidence</w:t>
+            </w:r>
+            <w:r>
+              <w:t xml:space="preserve"> </w:t>
+            </w:r>
+            <w:r>
+              <w:t xml:space="preserve">não vazio com justificativa</w:t>
+            </w:r>
+          </w:p>
+        </w:tc>
+      </w:tr>
+    </w:tbl>
     <w:p>
       <w:pPr>
         <w:pStyle w:val="BodyText"/>
@@ -872,73 +1188,668 @@
           <w:bCs/>
           <w:b/>
         </w:rPr>
-        <w:t xml:space="preserve">Alternativa B — Usar um único prompt</w:t>
-      </w:r>
+        <w:t xml:space="preserve">Diretriz do Orquestrador:</w:t>
+      </w:r>
+      <w:r>
+        <w:t xml:space="preserve"> </w:t>
+      </w:r>
+      <w:r>
+        <w:rPr>
+          <w:iCs/>
+          <w:i/>
+        </w:rPr>
+        <w:t xml:space="preserve">“</w:t>
+      </w:r>
+      <w:r>
+        <w:rPr>
+          <w:iCs/>
+          <w:i/>
+        </w:rPr>
+        <w:t xml:space="preserve">Cobertura sem qualidade não é cobertura. 100% coverage só é válido quando a avaliação é confiável.</w:t>
+      </w:r>
+      <w:r>
+        <w:rPr>
+          <w:iCs/>
+          <w:i/>
+        </w:rPr>
+        <w:t xml:space="preserve">”</w:t>
+      </w:r>
+    </w:p>
+    <w:bookmarkEnd w:id="26"/>
+    <w:bookmarkStart w:id="27" w:name="X058c3f006584ad3e345094be36278471c0b9846"/>
+    <w:p>
+      <w:pPr>
+        <w:pStyle w:val="Heading3"/>
+      </w:pPr>
+      <w:r>
+        <w:t xml:space="preserve">Ajuste 2 — Question Quality Gate: requisito permanece pendente</w:t>
+      </w:r>
+    </w:p>
+    <w:p>
+      <w:pPr>
+        <w:pStyle w:val="FirstParagraph"/>
+      </w:pPr>
+      <w:r>
+        <w:t xml:space="preserve">O comportamento original descartava perguntas com</w:t>
+      </w:r>
+      <w:r>
+        <w:t xml:space="preserve"> </w:t>
+      </w:r>
+      <w:r>
+        <w:rPr>
+          <w:rStyle w:val="VerbatimChar"/>
+        </w:rPr>
+        <w:t xml:space="preserve">score &lt; threshold</w:t>
+      </w:r>
+      <w:r>
+        <w:t xml:space="preserve"> </w:t>
+      </w:r>
+      <w:r>
+        <w:t xml:space="preserve">sem mecanismo de recuperação, deixando o requisito associado sem cobertura silenciosamente.</w:t>
+      </w:r>
+    </w:p>
+    <w:p>
+      <w:pPr>
+        <w:pStyle w:val="BodyText"/>
+      </w:pPr>
+      <w:r>
+        <w:t xml:space="preserve">O comportamento corrigido é:</w:t>
+      </w:r>
+    </w:p>
+    <w:p>
+      <w:pPr>
+        <w:numPr>
+          <w:ilvl w:val="0"/>
+          <w:numId w:val="1001"/>
+        </w:numPr>
+        <w:pStyle w:val="Compact"/>
+      </w:pPr>
+      <w:r>
+        <w:t xml:space="preserve">Pergunta com</w:t>
+      </w:r>
+      <w:r>
+        <w:t xml:space="preserve"> </w:t>
+      </w:r>
+      <w:r>
+        <w:rPr>
+          <w:rStyle w:val="VerbatimChar"/>
+        </w:rPr>
+        <w:t xml:space="preserve">score &lt; threshold</w:t>
+      </w:r>
+      <w:r>
+        <w:t xml:space="preserve"> </w:t>
+      </w:r>
+      <w:r>
+        <w:t xml:space="preserve">→ descartada (não incluída no questionário)</w:t>
+      </w:r>
+    </w:p>
+    <w:p>
+      <w:pPr>
+        <w:numPr>
+          <w:ilvl w:val="0"/>
+          <w:numId w:val="1001"/>
+        </w:numPr>
+        <w:pStyle w:val="Compact"/>
+      </w:pPr>
+      <w:r>
+        <w:t xml:space="preserve">O requisito associado permanece com status</w:t>
+      </w:r>
+      <w:r>
+        <w:t xml:space="preserve"> </w:t>
+      </w:r>
+      <w:r>
+        <w:rPr>
+          <w:rStyle w:val="VerbatimChar"/>
+        </w:rPr>
+        <w:t xml:space="preserve">pending_valid_question</w:t>
+      </w:r>
+    </w:p>
+    <w:p>
+      <w:pPr>
+        <w:numPr>
+          <w:ilvl w:val="0"/>
+          <w:numId w:val="1001"/>
+        </w:numPr>
+        <w:pStyle w:val="Compact"/>
+      </w:pPr>
+      <w:r>
+        <w:t xml:space="preserve">O sistema tenta reformular a pergunta com prompt alternativo (até 2 tentativas)</w:t>
+      </w:r>
+    </w:p>
+    <w:p>
+      <w:pPr>
+        <w:numPr>
+          <w:ilvl w:val="0"/>
+          <w:numId w:val="1001"/>
+        </w:numPr>
+        <w:pStyle w:val="Compact"/>
+      </w:pPr>
+      <w:r>
+        <w:t xml:space="preserve">Se após 2 tentativas nenhuma pergunta válida for gerada → requisito marcado como</w:t>
+      </w:r>
+      <w:r>
+        <w:t xml:space="preserve"> </w:t>
+      </w:r>
+      <w:r>
+        <w:rPr>
+          <w:rStyle w:val="VerbatimChar"/>
+        </w:rPr>
+        <w:t xml:space="preserve">no_valid_question_generated</w:t>
+      </w:r>
+      <w:r>
+        <w:t xml:space="preserve">, registrado no coverage report como lacuna</w:t>
+      </w:r>
+    </w:p>
+    <w:p>
+      <w:pPr>
+        <w:numPr>
+          <w:ilvl w:val="0"/>
+          <w:numId w:val="1001"/>
+        </w:numPr>
+        <w:pStyle w:val="Compact"/>
+      </w:pPr>
+      <w:r>
+        <w:t xml:space="preserve">O coverage report alerta o usuário sobre os requisitos sem pergunta válida antes de prosseguir</w:t>
+      </w:r>
+    </w:p>
+    <w:p>
+      <w:pPr>
+        <w:pStyle w:val="FirstParagraph"/>
+      </w:pPr>
       <w:r>
         <w:rPr>
           <w:bCs/>
           <w:b/>
         </w:rPr>
-        <w:t xml:space="preserve"> </w:t>
-      </w:r>
-      <w:r>
-        <w:rPr>
-          <w:bCs/>
-          <w:b/>
-        </w:rPr>
-        <w:t xml:space="preserve">“</w:t>
-      </w:r>
-      <w:r>
-        <w:rPr>
-          <w:bCs/>
-          <w:b/>
-        </w:rPr>
-        <w:t xml:space="preserve">mega</w:t>
-      </w:r>
-      <w:r>
-        <w:rPr>
-          <w:bCs/>
-          <w:b/>
-        </w:rPr>
-        <w:t xml:space="preserve">”</w:t>
-      </w:r>
-      <w:r>
-        <w:rPr>
-          <w:bCs/>
-          <w:b/>
-        </w:rPr>
-        <w:t xml:space="preserve"> </w:t>
-      </w:r>
-      <w:r>
-        <w:rPr>
-          <w:bCs/>
-          <w:b/>
-        </w:rPr>
-        <w:t xml:space="preserve">que gera tudo de uma vez (briefing + matriz + plano).</w:t>
-      </w:r>
-      <w:r>
-        <w:t xml:space="preserve"> </w:t>
-      </w:r>
-      <w:r>
-        <w:t xml:space="preserve">Descartada porque viola a Regra 4 (anti-alucinação) e impossibilita a rastreabilidade. Um único prompt não pode garantir que 100% dos requisitos aplicáveis foram avaliados.</w:t>
-      </w:r>
-    </w:p>
+        <w:t xml:space="preserve">Implicação:</w:t>
+      </w:r>
+      <w:r>
+        <w:t xml:space="preserve"> </w:t>
+      </w:r>
+      <w:r>
+        <w:t xml:space="preserve">o coverage gate bloqueia o briefing não apenas quando há requisitos sem resposta, mas também quando há requisitos sem pergunta válida gerada.</w:t>
+      </w:r>
+    </w:p>
+    <w:bookmarkEnd w:id="27"/>
+    <w:bookmarkStart w:id="28" w:name="Xd685add4b99e0c37e59d3e864c2e58a01fb7d13"/>
+    <w:p>
+      <w:pPr>
+        <w:pStyle w:val="Heading3"/>
+      </w:pPr>
+      <w:r>
+        <w:t xml:space="preserve">Ajuste 3 — evaluation_confidence no Gap (recomendado)</w:t>
+      </w:r>
+    </w:p>
+    <w:p>
+      <w:pPr>
+        <w:pStyle w:val="FirstParagraph"/>
+      </w:pPr>
+      <w:r>
+        <w:t xml:space="preserve">Adicionar o campo</w:t>
+      </w:r>
+      <w:r>
+        <w:t xml:space="preserve"> </w:t>
+      </w:r>
+      <w:r>
+        <w:rPr>
+          <w:rStyle w:val="VerbatimChar"/>
+        </w:rPr>
+        <w:t xml:space="preserve">evaluation_confidence</w:t>
+      </w:r>
+      <w:r>
+        <w:t xml:space="preserve"> </w:t>
+      </w:r>
+      <w:r>
+        <w:t xml:space="preserve">ao schema do Gap para registrar a confiança da classificação de conformidade, não apenas a confiança da pergunta:</w:t>
+      </w:r>
+    </w:p>
+    <w:p>
+      <w:pPr>
+        <w:pStyle w:val="SourceCode"/>
+      </w:pPr>
+      <w:r>
+        <w:rPr>
+          <w:rStyle w:val="KeywordTok"/>
+        </w:rPr>
+        <w:t xml:space="preserve">interface</w:t>
+      </w:r>
+      <w:r>
+        <w:rPr>
+          <w:rStyle w:val="NormalTok"/>
+        </w:rPr>
+        <w:t xml:space="preserve"> Gap {</w:t>
+      </w:r>
+      <w:r>
+        <w:br/>
+      </w:r>
+      <w:r>
+        <w:rPr>
+          <w:rStyle w:val="NormalTok"/>
+        </w:rPr>
+        <w:t xml:space="preserve">  </w:t>
+      </w:r>
+      <w:r>
+        <w:rPr>
+          <w:rStyle w:val="CommentTok"/>
+        </w:rPr>
+        <w:t xml:space="preserve">// ... campos existentes ...</w:t>
+      </w:r>
+      <w:r>
+        <w:br/>
+      </w:r>
+      <w:r>
+        <w:rPr>
+          <w:rStyle w:val="NormalTok"/>
+        </w:rPr>
+        <w:t xml:space="preserve">  evaluation_confidence</w:t>
+      </w:r>
+      <w:r>
+        <w:rPr>
+          <w:rStyle w:val="OperatorTok"/>
+        </w:rPr>
+        <w:t xml:space="preserve">:</w:t>
+      </w:r>
+      <w:r>
+        <w:rPr>
+          <w:rStyle w:val="NormalTok"/>
+        </w:rPr>
+        <w:t xml:space="preserve"> </w:t>
+      </w:r>
+      <w:r>
+        <w:rPr>
+          <w:rStyle w:val="StringTok"/>
+        </w:rPr>
+        <w:t xml:space="preserve">"high"</w:t>
+      </w:r>
+      <w:r>
+        <w:rPr>
+          <w:rStyle w:val="NormalTok"/>
+        </w:rPr>
+        <w:t xml:space="preserve"> </w:t>
+      </w:r>
+      <w:r>
+        <w:rPr>
+          <w:rStyle w:val="OperatorTok"/>
+        </w:rPr>
+        <w:t xml:space="preserve">|</w:t>
+      </w:r>
+      <w:r>
+        <w:rPr>
+          <w:rStyle w:val="NormalTok"/>
+        </w:rPr>
+        <w:t xml:space="preserve"> </w:t>
+      </w:r>
+      <w:r>
+        <w:rPr>
+          <w:rStyle w:val="StringTok"/>
+        </w:rPr>
+        <w:t xml:space="preserve">"medium"</w:t>
+      </w:r>
+      <w:r>
+        <w:rPr>
+          <w:rStyle w:val="NormalTok"/>
+        </w:rPr>
+        <w:t xml:space="preserve"> </w:t>
+      </w:r>
+      <w:r>
+        <w:rPr>
+          <w:rStyle w:val="OperatorTok"/>
+        </w:rPr>
+        <w:t xml:space="preserve">|</w:t>
+      </w:r>
+      <w:r>
+        <w:rPr>
+          <w:rStyle w:val="NormalTok"/>
+        </w:rPr>
+        <w:t xml:space="preserve"> </w:t>
+      </w:r>
+      <w:r>
+        <w:rPr>
+          <w:rStyle w:val="StringTok"/>
+        </w:rPr>
+        <w:t xml:space="preserve">"low"</w:t>
+      </w:r>
+      <w:r>
+        <w:rPr>
+          <w:rStyle w:val="OperatorTok"/>
+        </w:rPr>
+        <w:t xml:space="preserve">;</w:t>
+      </w:r>
+      <w:r>
+        <w:br/>
+      </w:r>
+      <w:r>
+        <w:rPr>
+          <w:rStyle w:val="NormalTok"/>
+        </w:rPr>
+        <w:t xml:space="preserve">  evaluation_confidence_reason</w:t>
+      </w:r>
+      <w:r>
+        <w:rPr>
+          <w:rStyle w:val="OperatorTok"/>
+        </w:rPr>
+        <w:t xml:space="preserve">?:</w:t>
+      </w:r>
+      <w:r>
+        <w:rPr>
+          <w:rStyle w:val="NormalTok"/>
+        </w:rPr>
+        <w:t xml:space="preserve"> </w:t>
+      </w:r>
+      <w:r>
+        <w:rPr>
+          <w:rStyle w:val="DataTypeTok"/>
+        </w:rPr>
+        <w:t xml:space="preserve">string</w:t>
+      </w:r>
+      <w:r>
+        <w:rPr>
+          <w:rStyle w:val="OperatorTok"/>
+        </w:rPr>
+        <w:t xml:space="preserve">;</w:t>
+      </w:r>
+      <w:r>
+        <w:rPr>
+          <w:rStyle w:val="NormalTok"/>
+        </w:rPr>
+        <w:t xml:space="preserve"> </w:t>
+      </w:r>
+      <w:r>
+        <w:rPr>
+          <w:rStyle w:val="CommentTok"/>
+        </w:rPr>
+        <w:t xml:space="preserve">// obrigatório quando "low"</w:t>
+      </w:r>
+      <w:r>
+        <w:br/>
+      </w:r>
+      <w:r>
+        <w:rPr>
+          <w:rStyle w:val="NormalTok"/>
+        </w:rPr>
+        <w:t xml:space="preserve">}</w:t>
+      </w:r>
+    </w:p>
+    <w:p>
+      <w:pPr>
+        <w:pStyle w:val="FirstParagraph"/>
+      </w:pPr>
+      <w:r>
+        <w:t xml:space="preserve">Regras de derivação do</w:t>
+      </w:r>
+      <w:r>
+        <w:t xml:space="preserve"> </w:t>
+      </w:r>
+      <w:r>
+        <w:rPr>
+          <w:rStyle w:val="VerbatimChar"/>
+        </w:rPr>
+        <w:t xml:space="preserve">evaluation_confidence</w:t>
+      </w:r>
+      <w:r>
+        <w:t xml:space="preserve">:</w:t>
+      </w:r>
+    </w:p>
+    <w:tbl>
+      <w:tblPr>
+        <w:tblStyle w:val="Table"/>
+        <w:tblW w:type="pct" w:w="5000"/>
+        <w:tblLook w:firstRow="1" w:lastRow="0" w:firstColumn="0" w:lastColumn="0" w:noHBand="0" w:noVBand="0" w:val="0020"/>
+        <w:jc w:val="start"/>
+        <w:tblLayout w:type="fixed"/>
+      </w:tblPr>
+      <w:tblGrid>
+        <w:gridCol w:w="2400"/>
+        <w:gridCol w:w="5520"/>
+      </w:tblGrid>
+      <w:tr>
+        <w:trPr>
+          <w:tblHeader w:val="true"/>
+        </w:trPr>
+        <w:tc>
+          <w:tcPr/>
+          <w:p>
+            <w:pPr>
+              <w:pStyle w:val="Compact"/>
+              <w:jc w:val="left"/>
+            </w:pPr>
+            <w:r>
+              <w:t xml:space="preserve">Condição</w:t>
+            </w:r>
+          </w:p>
+        </w:tc>
+        <w:tc>
+          <w:tcPr/>
+          <w:p>
+            <w:pPr>
+              <w:pStyle w:val="Compact"/>
+              <w:jc w:val="left"/>
+            </w:pPr>
+            <w:r>
+              <w:t xml:space="preserve">evaluation_confidence</w:t>
+            </w:r>
+          </w:p>
+        </w:tc>
+      </w:tr>
+      <w:tr>
+        <w:tc>
+          <w:tcPr/>
+          <w:p>
+            <w:pPr>
+              <w:pStyle w:val="Compact"/>
+              <w:jc w:val="left"/>
+            </w:pPr>
+            <w:r>
+              <w:rPr>
+                <w:rStyle w:val="VerbatimChar"/>
+              </w:rPr>
+              <w:t xml:space="preserve">classification_method === "deterministic"</w:t>
+            </w:r>
+            <w:r>
+              <w:t xml:space="preserve"> </w:t>
+            </w:r>
+            <w:r>
+              <w:t xml:space="preserve">+</w:t>
+            </w:r>
+            <w:r>
+              <w:t xml:space="preserve"> </w:t>
+            </w:r>
+            <w:r>
+              <w:rPr>
+                <w:rStyle w:val="VerbatimChar"/>
+              </w:rPr>
+              <w:t xml:space="preserve">evidence</w:t>
+            </w:r>
+            <w:r>
+              <w:t xml:space="preserve"> </w:t>
+            </w:r>
+            <w:r>
+              <w:t xml:space="preserve">não vazio</w:t>
+            </w:r>
+          </w:p>
+        </w:tc>
+        <w:tc>
+          <w:tcPr/>
+          <w:p>
+            <w:pPr>
+              <w:pStyle w:val="Compact"/>
+              <w:jc w:val="left"/>
+            </w:pPr>
+            <w:r>
+              <w:rPr>
+                <w:rStyle w:val="VerbatimChar"/>
+              </w:rPr>
+              <w:t xml:space="preserve">"high"</w:t>
+            </w:r>
+          </w:p>
+        </w:tc>
+      </w:tr>
+      <w:tr>
+        <w:tc>
+          <w:tcPr/>
+          <w:p>
+            <w:pPr>
+              <w:pStyle w:val="Compact"/>
+              <w:jc w:val="left"/>
+            </w:pPr>
+            <w:r>
+              <w:rPr>
+                <w:rStyle w:val="VerbatimChar"/>
+              </w:rPr>
+              <w:t xml:space="preserve">classification_method === "llm_assisted"</w:t>
+            </w:r>
+            <w:r>
+              <w:t xml:space="preserve"> </w:t>
+            </w:r>
+            <w:r>
+              <w:t xml:space="preserve">+</w:t>
+            </w:r>
+            <w:r>
+              <w:t xml:space="preserve"> </w:t>
+            </w:r>
+            <w:r>
+              <w:rPr>
+                <w:rStyle w:val="VerbatimChar"/>
+              </w:rPr>
+              <w:t xml:space="preserve">evidence</w:t>
+            </w:r>
+            <w:r>
+              <w:t xml:space="preserve"> </w:t>
+            </w:r>
+            <w:r>
+              <w:t xml:space="preserve">não vazio</w:t>
+            </w:r>
+          </w:p>
+        </w:tc>
+        <w:tc>
+          <w:tcPr/>
+          <w:p>
+            <w:pPr>
+              <w:pStyle w:val="Compact"/>
+              <w:jc w:val="left"/>
+            </w:pPr>
+            <w:r>
+              <w:rPr>
+                <w:rStyle w:val="VerbatimChar"/>
+              </w:rPr>
+              <w:t xml:space="preserve">"medium"</w:t>
+            </w:r>
+          </w:p>
+        </w:tc>
+      </w:tr>
+      <w:tr>
+        <w:tc>
+          <w:tcPr/>
+          <w:p>
+            <w:pPr>
+              <w:pStyle w:val="Compact"/>
+              <w:jc w:val="left"/>
+            </w:pPr>
+            <w:r>
+              <w:rPr>
+                <w:rStyle w:val="VerbatimChar"/>
+              </w:rPr>
+              <w:t xml:space="preserve">gap_status === "evidencia_insuficiente"</w:t>
+            </w:r>
+          </w:p>
+        </w:tc>
+        <w:tc>
+          <w:tcPr/>
+          <w:p>
+            <w:pPr>
+              <w:pStyle w:val="Compact"/>
+              <w:jc w:val="left"/>
+            </w:pPr>
+            <w:r>
+              <w:rPr>
+                <w:rStyle w:val="VerbatimChar"/>
+              </w:rPr>
+              <w:t xml:space="preserve">"low"</w:t>
+            </w:r>
+            <w:r>
+              <w:t xml:space="preserve"> </w:t>
+            </w:r>
+            <w:r>
+              <w:t xml:space="preserve">(sempre)</w:t>
+            </w:r>
+          </w:p>
+        </w:tc>
+      </w:tr>
+      <w:tr>
+        <w:tc>
+          <w:tcPr/>
+          <w:p>
+            <w:pPr>
+              <w:pStyle w:val="Compact"/>
+              <w:jc w:val="left"/>
+            </w:pPr>
+            <w:r>
+              <w:rPr>
+                <w:rStyle w:val="VerbatimChar"/>
+              </w:rPr>
+              <w:t xml:space="preserve">evidence</w:t>
+            </w:r>
+            <w:r>
+              <w:t xml:space="preserve"> </w:t>
+            </w:r>
+            <w:r>
+              <w:t xml:space="preserve">vazio ou muito curto (&lt; 20 chars)</w:t>
+            </w:r>
+          </w:p>
+        </w:tc>
+        <w:tc>
+          <w:tcPr/>
+          <w:p>
+            <w:pPr>
+              <w:pStyle w:val="Compact"/>
+              <w:jc w:val="left"/>
+            </w:pPr>
+            <w:r>
+              <w:rPr>
+                <w:rStyle w:val="VerbatimChar"/>
+              </w:rPr>
+              <w:t xml:space="preserve">"low"</w:t>
+            </w:r>
+          </w:p>
+        </w:tc>
+      </w:tr>
+    </w:tbl>
     <w:p>
       <w:pPr>
         <w:pStyle w:val="BodyText"/>
       </w:pPr>
       <w:r>
-        <w:rPr>
-          <w:bCs/>
-          <w:b/>
-        </w:rPr>
-        <w:t xml:space="preserve">Alternativa C — Implementar apenas o Gap Engine e o Risk Engine, mantendo o resto.</w:t>
-      </w:r>
-      <w:r>
-        <w:t xml:space="preserve"> </w:t>
-      </w:r>
-      <w:r>
-        <w:t xml:space="preserve">Descartada porque sem o Requirement Engine e o Coverage Engine, o Gap Engine não tem base formal de requisitos para classificar. A arquitetura é sistêmica — cada engine depende da anterior.</w:t>
+        <w:t xml:space="preserve">O campo</w:t>
+      </w:r>
+      <w:r>
+        <w:t xml:space="preserve"> </w:t>
+      </w:r>
+      <w:r>
+        <w:rPr>
+          <w:rStyle w:val="VerbatimChar"/>
+        </w:rPr>
+        <w:t xml:space="preserve">evaluation_confidence</w:t>
+      </w:r>
+      <w:r>
+        <w:t xml:space="preserve"> </w:t>
+      </w:r>
+      <w:r>
+        <w:t xml:space="preserve">é usado pelo Coverage Engine para calcular o coverage ponderado por confiança e pelo Risk Engine para ajustar o</w:t>
+      </w:r>
+      <w:r>
+        <w:t xml:space="preserve"> </w:t>
+      </w:r>
+      <w:r>
+        <w:rPr>
+          <w:rStyle w:val="VerbatimChar"/>
+        </w:rPr>
+        <w:t xml:space="preserve">ia_adjustment</w:t>
+      </w:r>
+      <w:r>
+        <w:t xml:space="preserve"> </w:t>
+      </w:r>
+      <w:r>
+        <w:t xml:space="preserve">dos riscos derivados de gaps de baixa confiança.</w:t>
       </w:r>
     </w:p>
     <w:p>
@@ -948,14 +1859,15 @@
         </w:pict>
       </w:r>
     </w:p>
-    <w:bookmarkEnd w:id="26"/>
-    <w:bookmarkStart w:id="27" w:name="consequências"/>
+    <w:bookmarkEnd w:id="28"/>
+    <w:bookmarkEnd w:id="29"/>
+    <w:bookmarkStart w:id="30" w:name="alternativas-consideradas"/>
     <w:p>
       <w:pPr>
         <w:pStyle w:val="Heading2"/>
       </w:pPr>
       <w:r>
-        <w:t xml:space="preserve">Consequências</w:t>
+        <w:t xml:space="preserve">Alternativas consideradas</w:t>
       </w:r>
     </w:p>
     <w:p>
@@ -967,37 +1879,13 @@
           <w:bCs/>
           <w:b/>
         </w:rPr>
-        <w:t xml:space="preserve">Positivas:</w:t>
-      </w:r>
-      <w:r>
-        <w:t xml:space="preserve"> </w:t>
-      </w:r>
-      <w:r>
-        <w:t xml:space="preserve">- Rastreabilidade completa de cada output até o requisito normativo de origem</w:t>
-      </w:r>
-      <w:r>
-        <w:t xml:space="preserve"> </w:t>
-      </w:r>
-      <w:r>
-        <w:t xml:space="preserve">- Coverage regulatório verificável e auditável</w:t>
-      </w:r>
-      <w:r>
-        <w:t xml:space="preserve"> </w:t>
-      </w:r>
-      <w:r>
-        <w:t xml:space="preserve">- Eliminação de alucinações por grounding obrigatório no RAG</w:t>
-      </w:r>
-      <w:r>
-        <w:t xml:space="preserve"> </w:t>
-      </w:r>
-      <w:r>
-        <w:t xml:space="preserve">- Matriz de riscos defensável em auditoria fiscal</w:t>
-      </w:r>
-      <w:r>
-        <w:t xml:space="preserve"> </w:t>
-      </w:r>
-      <w:r>
-        <w:t xml:space="preserve">- Plano de ação executável com prazo e responsável definidos</w:t>
+        <w:t xml:space="preserve">Alternativa A — Melhorar os prompts existentes sem reestruturar a arquitetura.</w:t>
+      </w:r>
+      <w:r>
+        <w:t xml:space="preserve"> </w:t>
+      </w:r>
+      <w:r>
+        <w:t xml:space="preserve">Descartada porque o problema não é de qualidade de prompt, mas de ausência de estrutura de dados formal entre as etapas. Prompts melhores sobre uma arquitetura sem contrato formal produzirão outputs melhores, mas não rastreáveis e não auditáveis.</w:t>
       </w:r>
     </w:p>
     <w:p>
@@ -1009,55 +1897,73 @@
           <w:bCs/>
           <w:b/>
         </w:rPr>
-        <w:t xml:space="preserve">Negativas / trade-offs:</w:t>
-      </w:r>
-      <w:r>
-        <w:t xml:space="preserve"> </w:t>
-      </w:r>
-      <w:r>
-        <w:t xml:space="preserve">- Aumento de latência por múltiplas chamadas ao LLM (estimado: +8-15s por projeto)</w:t>
-      </w:r>
-      <w:r>
-        <w:t xml:space="preserve"> </w:t>
-      </w:r>
-      <w:r>
-        <w:t xml:space="preserve">- Necessidade de corpus RAG atualizado e bem indexado para cada legislação</w:t>
-      </w:r>
-      <w:r>
-        <w:t xml:space="preserve"> </w:t>
-      </w:r>
-      <w:r>
-        <w:t xml:space="preserve">- Complexidade de implementação maior (6 engines vs. 1 prompt)</w:t>
-      </w:r>
-    </w:p>
-    <w:p>
-      <w:pPr>
-        <w:pStyle w:val="BodyText"/>
-      </w:pPr>
+        <w:t xml:space="preserve">Alternativa B — Usar um único prompt</w:t>
+      </w:r>
       <w:r>
         <w:rPr>
           <w:bCs/>
           <w:b/>
         </w:rPr>
-        <w:t xml:space="preserve">Mitigações:</w:t>
-      </w:r>
-      <w:r>
-        <w:t xml:space="preserve"> </w:t>
-      </w:r>
-      <w:r>
-        <w:t xml:space="preserve">- Cache de requisitos por perfil de empresa (CNAE + porte + regime) para reduzir latência</w:t>
-      </w:r>
-      <w:r>
-        <w:t xml:space="preserve"> </w:t>
-      </w:r>
-      <w:r>
-        <w:t xml:space="preserve">- Pipeline assíncrono com streaming de resultados parciais para o frontend</w:t>
-      </w:r>
-      <w:r>
-        <w:t xml:space="preserve"> </w:t>
-      </w:r>
-      <w:r>
-        <w:t xml:space="preserve">- Corpus RAG versionado com data de última atualização visível no briefing</w:t>
+        <w:t xml:space="preserve"> </w:t>
+      </w:r>
+      <w:r>
+        <w:rPr>
+          <w:bCs/>
+          <w:b/>
+        </w:rPr>
+        <w:t xml:space="preserve">“</w:t>
+      </w:r>
+      <w:r>
+        <w:rPr>
+          <w:bCs/>
+          <w:b/>
+        </w:rPr>
+        <w:t xml:space="preserve">mega</w:t>
+      </w:r>
+      <w:r>
+        <w:rPr>
+          <w:bCs/>
+          <w:b/>
+        </w:rPr>
+        <w:t xml:space="preserve">”</w:t>
+      </w:r>
+      <w:r>
+        <w:rPr>
+          <w:bCs/>
+          <w:b/>
+        </w:rPr>
+        <w:t xml:space="preserve"> </w:t>
+      </w:r>
+      <w:r>
+        <w:rPr>
+          <w:bCs/>
+          <w:b/>
+        </w:rPr>
+        <w:t xml:space="preserve">que gera tudo de uma vez (briefing + matriz + plano).</w:t>
+      </w:r>
+      <w:r>
+        <w:t xml:space="preserve"> </w:t>
+      </w:r>
+      <w:r>
+        <w:t xml:space="preserve">Descartada porque viola a Regra 4 (anti-alucinação) e impossibilita a rastreabilidade. Um único prompt não pode garantir que 100% dos requisitos aplicáveis foram avaliados.</w:t>
+      </w:r>
+    </w:p>
+    <w:p>
+      <w:pPr>
+        <w:pStyle w:val="BodyText"/>
+      </w:pPr>
+      <w:r>
+        <w:rPr>
+          <w:bCs/>
+          <w:b/>
+        </w:rPr>
+        <w:t xml:space="preserve">Alternativa C — Implementar apenas o Gap Engine e o Risk Engine, mantendo o resto.</w:t>
+      </w:r>
+      <w:r>
+        <w:t xml:space="preserve"> </w:t>
+      </w:r>
+      <w:r>
+        <w:t xml:space="preserve">Descartada porque sem o Requirement Engine e o Coverage Engine, o Gap Engine não tem base formal de requisitos para classificar. A arquitetura é sistêmica — cada engine depende da anterior.</w:t>
       </w:r>
     </w:p>
     <w:p>
@@ -1067,8 +1973,127 @@
         </w:pict>
       </w:r>
     </w:p>
-    <w:bookmarkEnd w:id="27"/>
-    <w:bookmarkStart w:id="28" w:name="critérios-de-sucesso"/>
+    <w:bookmarkEnd w:id="30"/>
+    <w:bookmarkStart w:id="31" w:name="consequências"/>
+    <w:p>
+      <w:pPr>
+        <w:pStyle w:val="Heading2"/>
+      </w:pPr>
+      <w:r>
+        <w:t xml:space="preserve">Consequências</w:t>
+      </w:r>
+    </w:p>
+    <w:p>
+      <w:pPr>
+        <w:pStyle w:val="FirstParagraph"/>
+      </w:pPr>
+      <w:r>
+        <w:rPr>
+          <w:bCs/>
+          <w:b/>
+        </w:rPr>
+        <w:t xml:space="preserve">Positivas:</w:t>
+      </w:r>
+      <w:r>
+        <w:t xml:space="preserve"> </w:t>
+      </w:r>
+      <w:r>
+        <w:t xml:space="preserve">- Rastreabilidade completa de cada output até o requisito normativo de origem</w:t>
+      </w:r>
+      <w:r>
+        <w:t xml:space="preserve"> </w:t>
+      </w:r>
+      <w:r>
+        <w:t xml:space="preserve">- Coverage regulatório verificável e auditável</w:t>
+      </w:r>
+      <w:r>
+        <w:t xml:space="preserve"> </w:t>
+      </w:r>
+      <w:r>
+        <w:t xml:space="preserve">- Eliminação de alucinações por grounding obrigatório no RAG</w:t>
+      </w:r>
+      <w:r>
+        <w:t xml:space="preserve"> </w:t>
+      </w:r>
+      <w:r>
+        <w:t xml:space="preserve">- Matriz de riscos defensável em auditoria fiscal</w:t>
+      </w:r>
+      <w:r>
+        <w:t xml:space="preserve"> </w:t>
+      </w:r>
+      <w:r>
+        <w:t xml:space="preserve">- Plano de ação executável com prazo e responsável definidos</w:t>
+      </w:r>
+    </w:p>
+    <w:p>
+      <w:pPr>
+        <w:pStyle w:val="BodyText"/>
+      </w:pPr>
+      <w:r>
+        <w:rPr>
+          <w:bCs/>
+          <w:b/>
+        </w:rPr>
+        <w:t xml:space="preserve">Negativas / trade-offs:</w:t>
+      </w:r>
+      <w:r>
+        <w:t xml:space="preserve"> </w:t>
+      </w:r>
+      <w:r>
+        <w:t xml:space="preserve">- Aumento de latência por múltiplas chamadas ao LLM (estimado: +8-15s por projeto)</w:t>
+      </w:r>
+      <w:r>
+        <w:t xml:space="preserve"> </w:t>
+      </w:r>
+      <w:r>
+        <w:t xml:space="preserve">- Necessidade de corpus RAG atualizado e bem indexado para cada legislação</w:t>
+      </w:r>
+      <w:r>
+        <w:t xml:space="preserve"> </w:t>
+      </w:r>
+      <w:r>
+        <w:t xml:space="preserve">- Complexidade de implementação maior (6 engines vs. 1 prompt)</w:t>
+      </w:r>
+    </w:p>
+    <w:p>
+      <w:pPr>
+        <w:pStyle w:val="BodyText"/>
+      </w:pPr>
+      <w:r>
+        <w:rPr>
+          <w:bCs/>
+          <w:b/>
+        </w:rPr>
+        <w:t xml:space="preserve">Mitigações:</w:t>
+      </w:r>
+      <w:r>
+        <w:t xml:space="preserve"> </w:t>
+      </w:r>
+      <w:r>
+        <w:t xml:space="preserve">- Cache de requisitos por perfil de empresa (CNAE + porte + regime) para reduzir latência</w:t>
+      </w:r>
+      <w:r>
+        <w:t xml:space="preserve"> </w:t>
+      </w:r>
+      <w:r>
+        <w:t xml:space="preserve">- Pipeline assíncrono com streaming de resultados parciais para o frontend</w:t>
+      </w:r>
+      <w:r>
+        <w:t xml:space="preserve"> </w:t>
+      </w:r>
+      <w:r>
+        <w:t xml:space="preserve">- Corpus RAG versionado com data de última atualização visível no briefing</w:t>
+      </w:r>
+    </w:p>
+    <w:p>
+      <w:r>
+        <w:pict>
+          <v:rect style="width:0;height:1.5pt" o:hralign="center" o:hrstd="t" o:hr="t"/>
+        </w:pict>
+      </w:r>
+    </w:p>
+    <w:bookmarkEnd w:id="31"/>
+    <w:bookmarkStart w:id="32" w:name="critérios-de-sucesso"/>
     <w:p>
       <w:pPr>
         <w:pStyle w:val="Heading2"/>
@@ -1384,8 +2409,8 @@
         </w:pict>
       </w:r>
     </w:p>
-    <w:bookmarkEnd w:id="28"/>
-    <w:bookmarkStart w:id="34" w:name="referências"/>
+    <w:bookmarkEnd w:id="32"/>
+    <w:bookmarkStart w:id="38" w:name="referências"/>
     <w:p>
       <w:pPr>
         <w:pStyle w:val="Heading2"/>
@@ -1398,11 +2423,11 @@
       <w:pPr>
         <w:numPr>
           <w:ilvl w:val="0"/>
-          <w:numId w:val="1001"/>
+          <w:numId w:val="1002"/>
         </w:numPr>
         <w:pStyle w:val="Compact"/>
       </w:pPr>
-      <w:hyperlink r:id="rId29">
+      <w:hyperlink r:id="rId33">
         <w:r>
           <w:rPr>
             <w:rStyle w:val="Hyperlink"/>
@@ -1415,11 +2440,11 @@
       <w:pPr>
         <w:numPr>
           <w:ilvl w:val="0"/>
-          <w:numId w:val="1001"/>
+          <w:numId w:val="1002"/>
         </w:numPr>
         <w:pStyle w:val="Compact"/>
       </w:pPr>
-      <w:hyperlink r:id="rId30">
+      <w:hyperlink r:id="rId34">
         <w:r>
           <w:rPr>
             <w:rStyle w:val="Hyperlink"/>
@@ -1432,11 +2457,11 @@
       <w:pPr>
         <w:numPr>
           <w:ilvl w:val="0"/>
-          <w:numId w:val="1001"/>
+          <w:numId w:val="1002"/>
         </w:numPr>
         <w:pStyle w:val="Compact"/>
       </w:pPr>
-      <w:hyperlink r:id="rId31">
+      <w:hyperlink r:id="rId35">
         <w:r>
           <w:rPr>
             <w:rStyle w:val="Hyperlink"/>
@@ -1449,11 +2474,11 @@
       <w:pPr>
         <w:numPr>
           <w:ilvl w:val="0"/>
-          <w:numId w:val="1001"/>
+          <w:numId w:val="1002"/>
         </w:numPr>
         <w:pStyle w:val="Compact"/>
       </w:pPr>
-      <w:hyperlink r:id="rId32">
+      <w:hyperlink r:id="rId36">
         <w:r>
           <w:rPr>
             <w:rStyle w:val="Hyperlink"/>
@@ -1466,11 +2491,11 @@
       <w:pPr>
         <w:numPr>
           <w:ilvl w:val="0"/>
-          <w:numId w:val="1001"/>
+          <w:numId w:val="1002"/>
         </w:numPr>
         <w:pStyle w:val="Compact"/>
       </w:pPr>
-      <w:hyperlink r:id="rId33">
+      <w:hyperlink r:id="rId37">
         <w:r>
           <w:rPr>
             <w:rStyle w:val="Hyperlink"/>
@@ -1483,7 +2508,7 @@
       <w:pPr>
         <w:numPr>
           <w:ilvl w:val="0"/>
-          <w:numId w:val="1001"/>
+          <w:numId w:val="1002"/>
         </w:numPr>
         <w:pStyle w:val="Compact"/>
       </w:pPr>
@@ -1500,7 +2525,7 @@
       <w:pPr>
         <w:numPr>
           <w:ilvl w:val="0"/>
-          <w:numId w:val="1001"/>
+          <w:numId w:val="1002"/>
         </w:numPr>
         <w:pStyle w:val="Compact"/>
       </w:pPr>
@@ -1513,8 +2538,8 @@
         </w:r>
       </w:hyperlink>
     </w:p>
-    <w:bookmarkEnd w:id="34"/>
-    <w:bookmarkEnd w:id="35"/>
+    <w:bookmarkEnd w:id="38"/>
+    <w:bookmarkEnd w:id="39"/>
     <w:sectPr/>
   </w:body>
 </w:document>
@@ -1621,6 +2646,91 @@
       </w:pPr>
     </w:lvl>
   </w:abstractNum>
+  <w:abstractNum w:abstractNumId="99411">
+    <w:nsid w:val="A99411"/>
+    <w:multiLevelType w:val="multilevel"/>
+    <w:lvl w:ilvl="0">
+      <w:start w:val="1"/>
+      <w:numFmt w:val="decimal"/>
+      <w:lvlText w:val="%1."/>
+      <w:lvlJc w:val="left"/>
+      <w:pPr>
+        <w:ind w:left="720" w:hanging="480"/>
+      </w:pPr>
+    </w:lvl>
+    <w:lvl w:ilvl="1">
+      <w:start w:val="1"/>
+      <w:numFmt w:val="decimal"/>
+      <w:lvlText w:val="%2."/>
+      <w:lvlJc w:val="left"/>
+      <w:pPr>
+        <w:ind w:left="1440" w:hanging="480"/>
+      </w:pPr>
+    </w:lvl>
+    <w:lvl w:ilvl="2">
+      <w:start w:val="1"/>
+      <w:numFmt w:val="decimal"/>
+      <w:lvlText w:val="%3."/>
+      <w:lvlJc w:val="left"/>
+      <w:pPr>
+        <w:ind w:left="2160" w:hanging="480"/>
+      </w:pPr>
+    </w:lvl>
+    <w:lvl w:ilvl="3">
+      <w:start w:val="1"/>
+      <w:numFmt w:val="decimal"/>
+      <w:lvlText w:val="%4."/>
+      <w:lvlJc w:val="left"/>
+      <w:pPr>
+        <w:ind w:left="2880" w:hanging="480"/>
+      </w:pPr>
+    </w:lvl>
+    <w:lvl w:ilvl="4">
+      <w:start w:val="1"/>
+      <w:numFmt w:val="decimal"/>
+      <w:lvlText w:val="%5."/>
+      <w:lvlJc w:val="left"/>
+      <w:pPr>
+        <w:ind w:left="3600" w:hanging="480"/>
+      </w:pPr>
+    </w:lvl>
+    <w:lvl w:ilvl="5">
+      <w:start w:val="1"/>
+      <w:numFmt w:val="decimal"/>
+      <w:lvlText w:val="%6."/>
+      <w:lvlJc w:val="left"/>
+      <w:pPr>
+        <w:ind w:left="4320" w:hanging="480"/>
+      </w:pPr>
+    </w:lvl>
+    <w:lvl w:ilvl="6">
+      <w:start w:val="1"/>
+      <w:numFmt w:val="decimal"/>
+      <w:lvlText w:val="%7."/>
+      <w:lvlJc w:val="left"/>
+      <w:pPr>
+        <w:ind w:left="5040" w:hanging="480"/>
+      </w:pPr>
+    </w:lvl>
+    <w:lvl w:ilvl="7">
+      <w:start w:val="1"/>
+      <w:numFmt w:val="decimal"/>
+      <w:lvlText w:val="%8."/>
+      <w:lvlJc w:val="left"/>
+      <w:pPr>
+        <w:ind w:left="5760" w:hanging="480"/>
+      </w:pPr>
+    </w:lvl>
+    <w:lvl w:ilvl="8">
+      <w:start w:val="1"/>
+      <w:numFmt w:val="decimal"/>
+      <w:lvlText w:val="%9."/>
+      <w:lvlJc w:val="left"/>
+      <w:pPr>
+        <w:ind w:left="6480" w:hanging="480"/>
+      </w:pPr>
+    </w:lvl>
+  </w:abstractNum>
   <w:abstractNum w:abstractNumId="991">
     <w:nsid w:val="A991"/>
     <w:multiLevelType w:val="multilevel"/>
@@ -1701,6 +2811,36 @@
     <w:abstractNumId w:val="990"/>
   </w:num>
   <w:num w:numId="1001">
+    <w:abstractNumId w:val="99411"/>
+    <w:lvlOverride w:ilvl="0">
+      <w:startOverride w:val="1"/>
+    </w:lvlOverride>
+    <w:lvlOverride w:ilvl="1">
+      <w:startOverride w:val="1"/>
+    </w:lvlOverride>
+    <w:lvlOverride w:ilvl="2">
+      <w:startOverride w:val="1"/>
+    </w:lvlOverride>
+    <w:lvlOverride w:ilvl="3">
+      <w:startOverride w:val="1"/>
+    </w:lvlOverride>
+    <w:lvlOverride w:ilvl="4">
+      <w:startOverride w:val="1"/>
+    </w:lvlOverride>
+    <w:lvlOverride w:ilvl="5">
+      <w:startOverride w:val="1"/>
+    </w:lvlOverride>
+    <w:lvlOverride w:ilvl="6">
+      <w:startOverride w:val="1"/>
+    </w:lvlOverride>
+    <w:lvlOverride w:ilvl="7">
+      <w:startOverride w:val="1"/>
+    </w:lvlOverride>
+    <w:lvlOverride w:ilvl="8">
+      <w:startOverride w:val="1"/>
+    </w:lvlOverride>
+  </w:num>
+  <w:num w:numId="1002">
     <w:abstractNumId w:val="991"/>
   </w:num>
 </w:numbering>

</xml_diff>